<commit_message>
tp1 not ended, notebooks
</commit_message>
<xml_diff>
--- a/training_01/TP01/TP_JOUR1.docx
+++ b/training_01/TP01/TP_JOUR1.docx
@@ -857,6 +857,9 @@
       <w:r>
         <w:t>présente</w:t>
       </w:r>
+      <w:r>
+        <w:t>s</w:t>
+      </w:r>
       <w:proofErr w:type="spellEnd"/>
       <w:r>
         <w:t xml:space="preserve"> ci-</w:t>
@@ -1131,6 +1134,35 @@
       <w:r>
         <w:t xml:space="preserve"> MAR</w:t>
       </w:r>
+      <w:r>
+        <w:t xml:space="preserve"> </w:t>
+      </w:r>
+      <w:proofErr w:type="spellStart"/>
+      <w:r>
+        <w:t>semble</w:t>
+      </w:r>
+      <w:proofErr w:type="spellEnd"/>
+      <w:r>
+        <w:t xml:space="preserve"> </w:t>
+      </w:r>
+      <w:proofErr w:type="spellStart"/>
+      <w:r>
+        <w:t>pertinente</w:t>
+      </w:r>
+      <w:proofErr w:type="spellEnd"/>
+      <w:r>
+        <w:t xml:space="preserve"> </w:t>
+      </w:r>
+      <w:proofErr w:type="spellStart"/>
+      <w:r>
+        <w:t>ici</w:t>
+      </w:r>
+      <w:proofErr w:type="spellEnd"/>
+      <w:r>
+        <w:t xml:space="preserve">. </w:t>
+      </w:r>
+    </w:p>
+    <w:p>
       <w:r>
         <w:br/>
       </w:r>

</xml_diff>